<commit_message>
implement interactive filter UI, badge-counted notification bell, and real-time toast alerts
</commit_message>
<xml_diff>
--- a/CooperativeDevelopment - Frontend/public/කාර්ය සාධක පරීක්ෂණ වාර්තා - ප්‍රධාන කළමනාකරණ සේවා නිලධාරි.docx
+++ b/CooperativeDevelopment - Frontend/public/කාර්ය සාධක පරීක්ෂණ වාර්තා - ප්‍රධාන කළමනාකරණ සේවා නිලධාරි.docx
@@ -1056,7 +1056,21 @@
           <w:sz w:val="22"/>
           <w:szCs w:val="22"/>
         </w:rPr>
-        <w:t>: ............................................................</w:t>
+        <w:t xml:space="preserve">: </w:t>
+      </w:r>
+      <w:r>
+        <w:rPr>
+          <w:sz w:val="22"/>
+          <w:szCs w:val="22"/>
+        </w:rPr>
+        <w:t>{{</w:t>
+      </w:r>
+      <w:r>
+        <w:rPr>
+          <w:sz w:val="22"/>
+          <w:szCs w:val="22"/>
+        </w:rPr>
+        <w:t>employeeName}}</w:t>
       </w:r>
     </w:p>
     <w:p>
@@ -1105,7 +1119,10 @@
           <w:sz w:val="22"/>
           <w:szCs w:val="22"/>
         </w:rPr>
-        <w:t>: ............................................................</w:t>
+        <w:t>:</w:t>
+      </w:r>
+      <w:r>
+        <w:t xml:space="preserve"> </w:t>
       </w:r>
     </w:p>
     <w:p>
@@ -15828,7 +15845,7 @@
   <w:style w:type="paragraph" w:default="1" w:styleId="Normal">
     <w:name w:val="Normal"/>
     <w:qFormat/>
-    <w:rsid w:val="008C0905"/>
+    <w:rsid w:val="00422C87"/>
   </w:style>
   <w:style w:type="paragraph" w:styleId="Heading1">
     <w:name w:val="heading 1"/>
@@ -16031,7 +16048,6 @@
   <w:style w:type="character" w:default="1" w:styleId="DefaultParagraphFont">
     <w:name w:val="Default Paragraph Font"/>
     <w:uiPriority w:val="1"/>
-    <w:semiHidden/>
     <w:unhideWhenUsed/>
   </w:style>
   <w:style w:type="table" w:default="1" w:styleId="TableNormal">
@@ -16423,6 +16439,36 @@
       </w:tblBorders>
     </w:tblPr>
   </w:style>
+  <w:style w:type="paragraph" w:styleId="HTMLPreformatted">
+    <w:name w:val="HTML Preformatted"/>
+    <w:basedOn w:val="Normal"/>
+    <w:link w:val="HTMLPreformattedChar"/>
+    <w:uiPriority w:val="99"/>
+    <w:semiHidden/>
+    <w:unhideWhenUsed/>
+    <w:rsid w:val="00B612A9"/>
+    <w:pPr>
+      <w:spacing w:after="0" w:line="240" w:lineRule="auto"/>
+    </w:pPr>
+    <w:rPr>
+      <w:rFonts w:ascii="Consolas" w:hAnsi="Consolas"/>
+      <w:sz w:val="20"/>
+      <w:szCs w:val="20"/>
+    </w:rPr>
+  </w:style>
+  <w:style w:type="character" w:customStyle="1" w:styleId="HTMLPreformattedChar">
+    <w:name w:val="HTML Preformatted Char"/>
+    <w:basedOn w:val="DefaultParagraphFont"/>
+    <w:link w:val="HTMLPreformatted"/>
+    <w:uiPriority w:val="99"/>
+    <w:semiHidden/>
+    <w:rsid w:val="00B612A9"/>
+    <w:rPr>
+      <w:rFonts w:ascii="Consolas" w:hAnsi="Consolas"/>
+      <w:sz w:val="20"/>
+      <w:szCs w:val="20"/>
+    </w:rPr>
+  </w:style>
 </w:styles>
 </file>
 

</xml_diff>